<commit_message>
Format RDS account findings with brand palette and table borders
</commit_message>
<xml_diff>
--- a/DQ_ENGINE/review_results/RDS/2026-10-27/RDS_account_level_findings.docx
+++ b/DQ_ENGINE/review_results/RDS/2026-10-27/RDS_account_level_findings.docx
@@ -85,262 +85,528 @@
       <w:tblPr>
         <w:tblStyle w:val="Table"/>
         <w:tblW w:type="auto" w:w="0"/>
-        <w:jc w:val="left"/>
+        <w:jc w:val="center"/>
+        <w:tblLayout w:type="fixed"/>
         <w:tblLook w:firstRow="1" w:lastRow="0" w:firstColumn="0" w:lastColumn="0" w:noHBand="0" w:noVBand="0" w:val="0020"/>
+        <w:tblBorders>
+          <w:top w:val="single" w:sz="6" w:color="1D252C"/>
+          <w:left w:val="single" w:sz="6" w:color="1D252C"/>
+          <w:bottom w:val="single" w:sz="6" w:color="1D252C"/>
+          <w:right w:val="single" w:sz="6" w:color="1D252C"/>
+          <w:insideH w:val="single" w:sz="6" w:color="1D252C"/>
+          <w:insideV w:val="single" w:sz="6" w:color="1D252C"/>
+        </w:tblBorders>
+        <w:tblCellMar>
+          <w:top w:w="80" w:type="dxa"/>
+          <w:bottom w:w="80" w:type="dxa"/>
+          <w:left w:w="80" w:type="dxa"/>
+          <w:right w:w="80" w:type="dxa"/>
+        </w:tblCellMar>
       </w:tblPr>
       <w:tblGrid>
-        <w:gridCol w:w="1584"/>
-        <w:gridCol w:w="1584"/>
-        <w:gridCol w:w="1584"/>
-        <w:gridCol w:w="1584"/>
-        <w:gridCol w:w="1584"/>
+        <w:gridCol w:w="1512"/>
+        <w:gridCol w:w="2203"/>
+        <w:gridCol w:w="2203"/>
+        <w:gridCol w:w="2203"/>
+        <w:gridCol w:w="2203"/>
       </w:tblGrid>
       <w:tr>
         <w:trPr>
           <w:tblHeader w:val="on"/>
+          <w:cantSplit/>
+          <w:tblHeader/>
         </w:trPr>
         <w:tc>
-          <w:tcPr/>
-          <w:p>
-            <w:pPr>
-              <w:pStyle w:val="Compact"/>
+          <w:tcPr>
+            <w:tcW w:type="dxa" w:w="1512"/>
+            <w:vAlign w:val="center"/>
+            <w:shd w:fill="FC4C02"/>
+          </w:tcPr>
+          <w:p>
+            <w:pPr>
+              <w:pStyle w:val="Compact"/>
+              <w:keepNext/>
+              <w:spacing w:before="0" w:after="0"/>
               <w:jc w:val="left"/>
             </w:pPr>
             <w:r>
+              <w:rPr>
+                <w:rFonts w:ascii="Calibri" w:hAnsi="Calibri"/>
+                <w:b/>
+                <w:color w:val="1D252C"/>
+                <w:sz w:val="16"/>
+              </w:rPr>
               <w:t xml:space="preserve">Month</w:t>
             </w:r>
           </w:p>
         </w:tc>
         <w:tc>
-          <w:tcPr/>
-          <w:p>
-            <w:pPr>
-              <w:pStyle w:val="Compact"/>
+          <w:tcPr>
+            <w:tcW w:type="dxa" w:w="2203"/>
+            <w:vAlign w:val="center"/>
+            <w:shd w:fill="FC4C02"/>
+          </w:tcPr>
+          <w:p>
+            <w:pPr>
+              <w:pStyle w:val="Compact"/>
+              <w:keepNext/>
+              <w:spacing w:before="0" w:after="0"/>
               <w:jc w:val="right"/>
             </w:pPr>
             <w:r>
+              <w:rPr>
+                <w:rFonts w:ascii="Calibri" w:hAnsi="Calibri"/>
+                <w:b/>
+                <w:color w:val="1D252C"/>
+                <w:sz w:val="16"/>
+              </w:rPr>
               <w:t xml:space="preserve">EVENT_DESCRIPTION</w:t>
             </w:r>
           </w:p>
         </w:tc>
         <w:tc>
-          <w:tcPr/>
-          <w:p>
-            <w:pPr>
-              <w:pStyle w:val="Compact"/>
+          <w:tcPr>
+            <w:tcW w:type="dxa" w:w="2203"/>
+            <w:vAlign w:val="center"/>
+            <w:shd w:fill="FC4C02"/>
+          </w:tcPr>
+          <w:p>
+            <w:pPr>
+              <w:pStyle w:val="Compact"/>
+              <w:keepNext/>
+              <w:spacing w:before="0" w:after="0"/>
               <w:jc w:val="right"/>
             </w:pPr>
             <w:r>
+              <w:rPr>
+                <w:rFonts w:ascii="Calibri" w:hAnsi="Calibri"/>
+                <w:b/>
+                <w:color w:val="1D252C"/>
+                <w:sz w:val="16"/>
+              </w:rPr>
               <w:t xml:space="preserve">MV_PROP_POSTCODE_NM</w:t>
             </w:r>
           </w:p>
         </w:tc>
         <w:tc>
-          <w:tcPr/>
-          <w:p>
-            <w:pPr>
-              <w:pStyle w:val="Compact"/>
+          <w:tcPr>
+            <w:tcW w:type="dxa" w:w="2203"/>
+            <w:vAlign w:val="center"/>
+            <w:shd w:fill="FC4C02"/>
+          </w:tcPr>
+          <w:p>
+            <w:pPr>
+              <w:pStyle w:val="Compact"/>
+              <w:keepNext/>
+              <w:spacing w:before="0" w:after="0"/>
               <w:jc w:val="right"/>
             </w:pPr>
             <w:r>
+              <w:rPr>
+                <w:rFonts w:ascii="Calibri" w:hAnsi="Calibri"/>
+                <w:b/>
+                <w:color w:val="1D252C"/>
+                <w:sz w:val="16"/>
+              </w:rPr>
               <w:t xml:space="preserve">PCKG_BOVO_VAL_AMT</w:t>
             </w:r>
           </w:p>
         </w:tc>
         <w:tc>
-          <w:tcPr/>
-          <w:p>
-            <w:pPr>
-              <w:pStyle w:val="Compact"/>
+          <w:tcPr>
+            <w:tcW w:type="dxa" w:w="2203"/>
+            <w:vAlign w:val="center"/>
+            <w:shd w:fill="FC4C02"/>
+          </w:tcPr>
+          <w:p>
+            <w:pPr>
+              <w:pStyle w:val="Compact"/>
+              <w:keepNext/>
+              <w:spacing w:before="0" w:after="0"/>
               <w:jc w:val="right"/>
             </w:pPr>
             <w:r>
+              <w:rPr>
+                <w:rFonts w:ascii="Calibri" w:hAnsi="Calibri"/>
+                <w:b/>
+                <w:color w:val="1D252C"/>
+                <w:sz w:val="16"/>
+              </w:rPr>
               <w:t xml:space="preserve">PCKG_REPAY_AMT</w:t>
             </w:r>
           </w:p>
         </w:tc>
       </w:tr>
       <w:tr>
-        <w:tc>
-          <w:tcPr/>
-          <w:p>
-            <w:pPr>
-              <w:pStyle w:val="Compact"/>
+        <w:trPr>
+          <w:cantSplit/>
+        </w:trPr>
+        <w:tc>
+          <w:tcPr>
+            <w:tcW w:type="dxa" w:w="1512"/>
+            <w:vAlign w:val="center"/>
+            <w:shd w:fill="FFFFFF"/>
+          </w:tcPr>
+          <w:p>
+            <w:pPr>
+              <w:pStyle w:val="Compact"/>
+              <w:keepNext w:val="0"/>
+              <w:spacing w:before="0" w:after="0"/>
               <w:jc w:val="left"/>
             </w:pPr>
             <w:r>
+              <w:rPr>
+                <w:rFonts w:ascii="Calibri" w:hAnsi="Calibri"/>
+                <w:b w:val="0"/>
+                <w:color w:val="1D252C"/>
+                <w:sz w:val="18"/>
+              </w:rPr>
               <w:t xml:space="preserve">February 2019</w:t>
             </w:r>
           </w:p>
         </w:tc>
         <w:tc>
-          <w:tcPr/>
-          <w:p>
-            <w:pPr>
-              <w:pStyle w:val="Compact"/>
+          <w:tcPr>
+            <w:tcW w:type="dxa" w:w="2203"/>
+            <w:vAlign w:val="center"/>
+            <w:shd w:fill="FFFFFF"/>
+          </w:tcPr>
+          <w:p>
+            <w:pPr>
+              <w:pStyle w:val="Compact"/>
+              <w:keepNext w:val="0"/>
+              <w:spacing w:before="0" w:after="0"/>
               <w:jc w:val="right"/>
             </w:pPr>
             <w:r>
+              <w:rPr>
+                <w:rFonts w:ascii="Calibri" w:hAnsi="Calibri"/>
+                <w:b w:val="0"/>
+                <w:color w:val="1D252C"/>
+                <w:sz w:val="18"/>
+              </w:rPr>
               <w:t xml:space="preserve">8,828</w:t>
             </w:r>
           </w:p>
         </w:tc>
         <w:tc>
-          <w:tcPr/>
-          <w:p>
-            <w:pPr>
-              <w:pStyle w:val="Compact"/>
+          <w:tcPr>
+            <w:tcW w:type="dxa" w:w="2203"/>
+            <w:vAlign w:val="center"/>
+            <w:shd w:fill="FFFFFF"/>
+          </w:tcPr>
+          <w:p>
+            <w:pPr>
+              <w:pStyle w:val="Compact"/>
+              <w:keepNext w:val="0"/>
+              <w:spacing w:before="0" w:after="0"/>
               <w:jc w:val="right"/>
             </w:pPr>
             <w:r>
+              <w:rPr>
+                <w:rFonts w:ascii="Calibri" w:hAnsi="Calibri"/>
+                <w:b w:val="0"/>
+                <w:color w:val="1D252C"/>
+                <w:sz w:val="18"/>
+              </w:rPr>
               <w:t xml:space="preserve">9,123</w:t>
             </w:r>
           </w:p>
         </w:tc>
         <w:tc>
-          <w:tcPr/>
-          <w:p>
-            <w:pPr>
-              <w:pStyle w:val="Compact"/>
+          <w:tcPr>
+            <w:tcW w:type="dxa" w:w="2203"/>
+            <w:vAlign w:val="center"/>
+            <w:shd w:fill="FFFFFF"/>
+          </w:tcPr>
+          <w:p>
+            <w:pPr>
+              <w:pStyle w:val="Compact"/>
+              <w:keepNext w:val="0"/>
+              <w:spacing w:before="0" w:after="0"/>
               <w:jc w:val="right"/>
             </w:pPr>
             <w:r>
+              <w:rPr>
+                <w:rFonts w:ascii="Calibri" w:hAnsi="Calibri"/>
+                <w:b w:val="0"/>
+                <w:color w:val="1D252C"/>
+                <w:sz w:val="18"/>
+              </w:rPr>
               <w:t xml:space="preserve">9,111</w:t>
             </w:r>
           </w:p>
         </w:tc>
         <w:tc>
-          <w:tcPr/>
-          <w:p>
-            <w:pPr>
-              <w:pStyle w:val="Compact"/>
+          <w:tcPr>
+            <w:tcW w:type="dxa" w:w="2203"/>
+            <w:vAlign w:val="center"/>
+            <w:shd w:fill="FFFFFF"/>
+          </w:tcPr>
+          <w:p>
+            <w:pPr>
+              <w:pStyle w:val="Compact"/>
+              <w:keepNext w:val="0"/>
+              <w:spacing w:before="0" w:after="0"/>
               <w:jc w:val="right"/>
             </w:pPr>
             <w:r>
+              <w:rPr>
+                <w:rFonts w:ascii="Calibri" w:hAnsi="Calibri"/>
+                <w:b w:val="0"/>
+                <w:color w:val="1D252C"/>
+                <w:sz w:val="18"/>
+              </w:rPr>
               <w:t xml:space="preserve">9,115</w:t>
             </w:r>
           </w:p>
         </w:tc>
       </w:tr>
       <w:tr>
-        <w:tc>
-          <w:tcPr/>
-          <w:p>
-            <w:pPr>
-              <w:pStyle w:val="Compact"/>
+        <w:trPr>
+          <w:cantSplit/>
+        </w:trPr>
+        <w:tc>
+          <w:tcPr>
+            <w:tcW w:type="dxa" w:w="1512"/>
+            <w:vAlign w:val="center"/>
+            <w:shd w:fill="FFFFFF"/>
+          </w:tcPr>
+          <w:p>
+            <w:pPr>
+              <w:pStyle w:val="Compact"/>
+              <w:keepNext w:val="0"/>
+              <w:spacing w:before="0" w:after="0"/>
               <w:jc w:val="left"/>
             </w:pPr>
             <w:r>
+              <w:rPr>
+                <w:rFonts w:ascii="Calibri" w:hAnsi="Calibri"/>
+                <w:b w:val="0"/>
+                <w:color w:val="1D252C"/>
+                <w:sz w:val="18"/>
+              </w:rPr>
               <w:t xml:space="preserve">May 2019</w:t>
             </w:r>
           </w:p>
         </w:tc>
         <w:tc>
-          <w:tcPr/>
-          <w:p>
-            <w:pPr>
-              <w:pStyle w:val="Compact"/>
+          <w:tcPr>
+            <w:tcW w:type="dxa" w:w="2203"/>
+            <w:vAlign w:val="center"/>
+            <w:shd w:fill="FFFFFF"/>
+          </w:tcPr>
+          <w:p>
+            <w:pPr>
+              <w:pStyle w:val="Compact"/>
+              <w:keepNext w:val="0"/>
+              <w:spacing w:before="0" w:after="0"/>
               <w:jc w:val="right"/>
             </w:pPr>
             <w:r>
+              <w:rPr>
+                <w:rFonts w:ascii="Calibri" w:hAnsi="Calibri"/>
+                <w:b w:val="0"/>
+                <w:color w:val="1D252C"/>
+                <w:sz w:val="18"/>
+              </w:rPr>
               <w:t xml:space="preserve">12,208</w:t>
             </w:r>
           </w:p>
         </w:tc>
         <w:tc>
-          <w:tcPr/>
-          <w:p>
-            <w:pPr>
-              <w:pStyle w:val="Compact"/>
+          <w:tcPr>
+            <w:tcW w:type="dxa" w:w="2203"/>
+            <w:vAlign w:val="center"/>
+            <w:shd w:fill="FFFFFF"/>
+          </w:tcPr>
+          <w:p>
+            <w:pPr>
+              <w:pStyle w:val="Compact"/>
+              <w:keepNext w:val="0"/>
+              <w:spacing w:before="0" w:after="0"/>
               <w:jc w:val="right"/>
             </w:pPr>
             <w:r>
+              <w:rPr>
+                <w:rFonts w:ascii="Calibri" w:hAnsi="Calibri"/>
+                <w:b w:val="0"/>
+                <w:color w:val="1D252C"/>
+                <w:sz w:val="18"/>
+              </w:rPr>
               <w:t xml:space="preserve">12,710</w:t>
             </w:r>
           </w:p>
         </w:tc>
         <w:tc>
-          <w:tcPr/>
-          <w:p>
-            <w:pPr>
-              <w:pStyle w:val="Compact"/>
+          <w:tcPr>
+            <w:tcW w:type="dxa" w:w="2203"/>
+            <w:vAlign w:val="center"/>
+            <w:shd w:fill="FFFFFF"/>
+          </w:tcPr>
+          <w:p>
+            <w:pPr>
+              <w:pStyle w:val="Compact"/>
+              <w:keepNext w:val="0"/>
+              <w:spacing w:before="0" w:after="0"/>
               <w:jc w:val="right"/>
             </w:pPr>
             <w:r>
+              <w:rPr>
+                <w:rFonts w:ascii="Calibri" w:hAnsi="Calibri"/>
+                <w:b w:val="0"/>
+                <w:color w:val="1D252C"/>
+                <w:sz w:val="18"/>
+              </w:rPr>
               <w:t xml:space="preserve">12,690</w:t>
             </w:r>
           </w:p>
         </w:tc>
         <w:tc>
-          <w:tcPr/>
-          <w:p>
-            <w:pPr>
-              <w:pStyle w:val="Compact"/>
+          <w:tcPr>
+            <w:tcW w:type="dxa" w:w="2203"/>
+            <w:vAlign w:val="center"/>
+            <w:shd w:fill="FFFFFF"/>
+          </w:tcPr>
+          <w:p>
+            <w:pPr>
+              <w:pStyle w:val="Compact"/>
+              <w:keepNext w:val="0"/>
+              <w:spacing w:before="0" w:after="0"/>
               <w:jc w:val="right"/>
             </w:pPr>
             <w:r>
+              <w:rPr>
+                <w:rFonts w:ascii="Calibri" w:hAnsi="Calibri"/>
+                <w:b w:val="0"/>
+                <w:color w:val="1D252C"/>
+                <w:sz w:val="18"/>
+              </w:rPr>
               <w:t xml:space="preserve">12,660</w:t>
             </w:r>
           </w:p>
         </w:tc>
       </w:tr>
       <w:tr>
-        <w:tc>
-          <w:tcPr/>
-          <w:p>
-            <w:pPr>
-              <w:pStyle w:val="Compact"/>
+        <w:trPr>
+          <w:cantSplit/>
+        </w:trPr>
+        <w:tc>
+          <w:tcPr>
+            <w:tcW w:type="dxa" w:w="1512"/>
+            <w:vAlign w:val="center"/>
+            <w:shd w:fill="FFFFFF"/>
+          </w:tcPr>
+          <w:p>
+            <w:pPr>
+              <w:pStyle w:val="Compact"/>
+              <w:keepNext w:val="0"/>
+              <w:spacing w:before="0" w:after="0"/>
               <w:jc w:val="left"/>
             </w:pPr>
             <w:r>
+              <w:rPr>
+                <w:rFonts w:ascii="Calibri" w:hAnsi="Calibri"/>
+                <w:b w:val="0"/>
+                <w:color w:val="1D252C"/>
+                <w:sz w:val="18"/>
+              </w:rPr>
               <w:t xml:space="preserve">February 2020</w:t>
             </w:r>
           </w:p>
         </w:tc>
         <w:tc>
-          <w:tcPr/>
-          <w:p>
-            <w:pPr>
-              <w:pStyle w:val="Compact"/>
+          <w:tcPr>
+            <w:tcW w:type="dxa" w:w="2203"/>
+            <w:vAlign w:val="center"/>
+            <w:shd w:fill="FFFFFF"/>
+          </w:tcPr>
+          <w:p>
+            <w:pPr>
+              <w:pStyle w:val="Compact"/>
+              <w:keepNext w:val="0"/>
+              <w:spacing w:before="0" w:after="0"/>
               <w:jc w:val="right"/>
             </w:pPr>
             <w:r>
+              <w:rPr>
+                <w:rFonts w:ascii="Calibri" w:hAnsi="Calibri"/>
+                <w:b w:val="0"/>
+                <w:color w:val="1D252C"/>
+                <w:sz w:val="18"/>
+              </w:rPr>
               <w:t xml:space="preserve">2,025</w:t>
             </w:r>
           </w:p>
         </w:tc>
         <w:tc>
-          <w:tcPr/>
-          <w:p>
-            <w:pPr>
-              <w:pStyle w:val="Compact"/>
+          <w:tcPr>
+            <w:tcW w:type="dxa" w:w="2203"/>
+            <w:vAlign w:val="center"/>
+            <w:shd w:fill="FFFFFF"/>
+          </w:tcPr>
+          <w:p>
+            <w:pPr>
+              <w:pStyle w:val="Compact"/>
+              <w:keepNext w:val="0"/>
+              <w:spacing w:before="0" w:after="0"/>
               <w:jc w:val="right"/>
             </w:pPr>
             <w:r>
+              <w:rPr>
+                <w:rFonts w:ascii="Calibri" w:hAnsi="Calibri"/>
+                <w:b w:val="0"/>
+                <w:color w:val="1D252C"/>
+                <w:sz w:val="18"/>
+              </w:rPr>
               <w:t xml:space="preserve">2,460</w:t>
             </w:r>
           </w:p>
         </w:tc>
         <w:tc>
-          <w:tcPr/>
-          <w:p>
-            <w:pPr>
-              <w:pStyle w:val="Compact"/>
+          <w:tcPr>
+            <w:tcW w:type="dxa" w:w="2203"/>
+            <w:vAlign w:val="center"/>
+            <w:shd w:fill="FFFFFF"/>
+          </w:tcPr>
+          <w:p>
+            <w:pPr>
+              <w:pStyle w:val="Compact"/>
+              <w:keepNext w:val="0"/>
+              <w:spacing w:before="0" w:after="0"/>
               <w:jc w:val="right"/>
             </w:pPr>
             <w:r>
+              <w:rPr>
+                <w:rFonts w:ascii="Calibri" w:hAnsi="Calibri"/>
+                <w:b w:val="0"/>
+                <w:color w:val="1D252C"/>
+                <w:sz w:val="18"/>
+              </w:rPr>
               <w:t xml:space="preserve">2,457</w:t>
             </w:r>
           </w:p>
         </w:tc>
         <w:tc>
-          <w:tcPr/>
-          <w:p>
-            <w:pPr>
-              <w:pStyle w:val="Compact"/>
+          <w:tcPr>
+            <w:tcW w:type="dxa" w:w="2203"/>
+            <w:vAlign w:val="center"/>
+            <w:shd w:fill="FFFFFF"/>
+          </w:tcPr>
+          <w:p>
+            <w:pPr>
+              <w:pStyle w:val="Compact"/>
+              <w:keepNext w:val="0"/>
+              <w:spacing w:before="0" w:after="0"/>
               <w:jc w:val="right"/>
             </w:pPr>
             <w:r>
+              <w:rPr>
+                <w:rFonts w:ascii="Calibri" w:hAnsi="Calibri"/>
+                <w:b w:val="0"/>
+                <w:color w:val="1D252C"/>
+                <w:sz w:val="18"/>
+              </w:rPr>
               <w:t xml:space="preserve">2,445</w:t>
             </w:r>
           </w:p>
@@ -705,163 +971,330 @@
       <w:tblPr>
         <w:tblStyle w:val="Table"/>
         <w:tblW w:type="auto" w:w="0"/>
-        <w:jc w:val="left"/>
+        <w:jc w:val="center"/>
+        <w:tblLayout w:type="fixed"/>
         <w:tblLook w:firstRow="1" w:lastRow="0" w:firstColumn="0" w:lastColumn="0" w:noHBand="0" w:noVBand="0" w:val="0020"/>
+        <w:tblBorders>
+          <w:top w:val="single" w:sz="6" w:color="1D252C"/>
+          <w:left w:val="single" w:sz="6" w:color="1D252C"/>
+          <w:bottom w:val="single" w:sz="6" w:color="1D252C"/>
+          <w:right w:val="single" w:sz="6" w:color="1D252C"/>
+          <w:insideH w:val="single" w:sz="6" w:color="1D252C"/>
+          <w:insideV w:val="single" w:sz="6" w:color="1D252C"/>
+        </w:tblBorders>
+        <w:tblCellMar>
+          <w:top w:w="80" w:type="dxa"/>
+          <w:bottom w:w="80" w:type="dxa"/>
+          <w:left w:w="80" w:type="dxa"/>
+          <w:right w:w="80" w:type="dxa"/>
+        </w:tblCellMar>
       </w:tblPr>
       <w:tblGrid>
-        <w:gridCol w:w="1980"/>
-        <w:gridCol w:w="1980"/>
-        <w:gridCol w:w="1980"/>
-        <w:gridCol w:w="1980"/>
+        <w:gridCol w:w="4464"/>
+        <w:gridCol w:w="1953"/>
+        <w:gridCol w:w="1954"/>
+        <w:gridCol w:w="1954"/>
       </w:tblGrid>
       <w:tr>
         <w:trPr>
           <w:tblHeader w:val="on"/>
+          <w:cantSplit/>
+          <w:tblHeader/>
         </w:trPr>
         <w:tc>
-          <w:tcPr/>
-          <w:p>
-            <w:pPr>
-              <w:pStyle w:val="Compact"/>
+          <w:tcPr>
+            <w:tcW w:type="dxa" w:w="4464"/>
+            <w:vAlign w:val="center"/>
+            <w:shd w:fill="FC4C02"/>
+          </w:tcPr>
+          <w:p>
+            <w:pPr>
+              <w:pStyle w:val="Compact"/>
+              <w:keepNext/>
+              <w:spacing w:before="0" w:after="0"/>
               <w:jc w:val="left"/>
             </w:pPr>
             <w:r>
+              <w:rPr>
+                <w:rFonts w:ascii="Calibri" w:hAnsi="Calibri"/>
+                <w:b/>
+                <w:color w:val="1D252C"/>
+                <w:sz w:val="18"/>
+              </w:rPr>
               <w:t xml:space="preserve">Field</w:t>
             </w:r>
           </w:p>
         </w:tc>
         <w:tc>
-          <w:tcPr/>
-          <w:p>
-            <w:pPr>
-              <w:pStyle w:val="Compact"/>
+          <w:tcPr>
+            <w:tcW w:type="dxa" w:w="1953"/>
+            <w:vAlign w:val="center"/>
+            <w:shd w:fill="FC4C02"/>
+          </w:tcPr>
+          <w:p>
+            <w:pPr>
+              <w:pStyle w:val="Compact"/>
+              <w:keepNext/>
+              <w:spacing w:before="0" w:after="0"/>
               <w:jc w:val="right"/>
             </w:pPr>
             <w:r>
+              <w:rPr>
+                <w:rFonts w:ascii="Calibri" w:hAnsi="Calibri"/>
+                <w:b/>
+                <w:color w:val="1D252C"/>
+                <w:sz w:val="18"/>
+              </w:rPr>
               <w:t xml:space="preserve">December 2013</w:t>
             </w:r>
           </w:p>
         </w:tc>
         <w:tc>
-          <w:tcPr/>
-          <w:p>
-            <w:pPr>
-              <w:pStyle w:val="Compact"/>
+          <w:tcPr>
+            <w:tcW w:type="dxa" w:w="1954"/>
+            <w:vAlign w:val="center"/>
+            <w:shd w:fill="FC4C02"/>
+          </w:tcPr>
+          <w:p>
+            <w:pPr>
+              <w:pStyle w:val="Compact"/>
+              <w:keepNext/>
+              <w:spacing w:before="0" w:after="0"/>
               <w:jc w:val="right"/>
             </w:pPr>
             <w:r>
+              <w:rPr>
+                <w:rFonts w:ascii="Calibri" w:hAnsi="Calibri"/>
+                <w:b/>
+                <w:color w:val="1D252C"/>
+                <w:sz w:val="18"/>
+              </w:rPr>
               <w:t xml:space="preserve">November 2016</w:t>
             </w:r>
           </w:p>
         </w:tc>
         <w:tc>
-          <w:tcPr/>
-          <w:p>
-            <w:pPr>
-              <w:pStyle w:val="Compact"/>
+          <w:tcPr>
+            <w:tcW w:type="dxa" w:w="1954"/>
+            <w:vAlign w:val="center"/>
+            <w:shd w:fill="FC4C02"/>
+          </w:tcPr>
+          <w:p>
+            <w:pPr>
+              <w:pStyle w:val="Compact"/>
+              <w:keepNext/>
+              <w:spacing w:before="0" w:after="0"/>
               <w:jc w:val="right"/>
             </w:pPr>
             <w:r>
+              <w:rPr>
+                <w:rFonts w:ascii="Calibri" w:hAnsi="Calibri"/>
+                <w:b/>
+                <w:color w:val="1D252C"/>
+                <w:sz w:val="18"/>
+              </w:rPr>
               <w:t xml:space="preserve">November 2018</w:t>
             </w:r>
           </w:p>
         </w:tc>
       </w:tr>
       <w:tr>
-        <w:tc>
-          <w:tcPr/>
-          <w:p>
-            <w:pPr>
-              <w:pStyle w:val="Compact"/>
+        <w:trPr>
+          <w:cantSplit/>
+        </w:trPr>
+        <w:tc>
+          <w:tcPr>
+            <w:tcW w:type="dxa" w:w="4464"/>
+            <w:vAlign w:val="center"/>
+            <w:shd w:fill="FFFFFF"/>
+          </w:tcPr>
+          <w:p>
+            <w:pPr>
+              <w:pStyle w:val="Compact"/>
+              <w:keepNext w:val="0"/>
+              <w:spacing w:before="0" w:after="0"/>
               <w:jc w:val="left"/>
             </w:pPr>
             <w:r>
+              <w:rPr>
+                <w:rFonts w:ascii="Calibri" w:hAnsi="Calibri"/>
+                <w:b w:val="0"/>
+                <w:color w:val="1D252C"/>
+                <w:sz w:val="18"/>
+              </w:rPr>
               <w:t xml:space="preserve">MV_PCKG_SAV_DEP_TO_BALANCE_RT</w:t>
             </w:r>
           </w:p>
         </w:tc>
         <w:tc>
-          <w:tcPr/>
-          <w:p>
-            <w:pPr>
-              <w:pStyle w:val="Compact"/>
+          <w:tcPr>
+            <w:tcW w:type="dxa" w:w="1953"/>
+            <w:vAlign w:val="center"/>
+            <w:shd w:fill="FFFFFF"/>
+          </w:tcPr>
+          <w:p>
+            <w:pPr>
+              <w:pStyle w:val="Compact"/>
+              <w:keepNext w:val="0"/>
+              <w:spacing w:before="0" w:after="0"/>
               <w:jc w:val="right"/>
             </w:pPr>
             <w:r>
+              <w:rPr>
+                <w:rFonts w:ascii="Calibri" w:hAnsi="Calibri"/>
+                <w:b w:val="0"/>
+                <w:color w:val="1D252C"/>
+                <w:sz w:val="18"/>
+              </w:rPr>
               <w:t xml:space="preserve">908</w:t>
             </w:r>
           </w:p>
         </w:tc>
         <w:tc>
-          <w:tcPr/>
-          <w:p>
-            <w:pPr>
-              <w:pStyle w:val="Compact"/>
+          <w:tcPr>
+            <w:tcW w:type="dxa" w:w="1954"/>
+            <w:vAlign w:val="center"/>
+            <w:shd w:fill="FFFFFF"/>
+          </w:tcPr>
+          <w:p>
+            <w:pPr>
+              <w:pStyle w:val="Compact"/>
+              <w:keepNext w:val="0"/>
+              <w:spacing w:before="0" w:after="0"/>
               <w:jc w:val="right"/>
             </w:pPr>
             <w:r>
+              <w:rPr>
+                <w:rFonts w:ascii="Calibri" w:hAnsi="Calibri"/>
+                <w:b w:val="0"/>
+                <w:color w:val="1D252C"/>
+                <w:sz w:val="18"/>
+              </w:rPr>
               <w:t xml:space="preserve">914</w:t>
             </w:r>
           </w:p>
         </w:tc>
         <w:tc>
-          <w:tcPr/>
-          <w:p>
-            <w:pPr>
-              <w:pStyle w:val="Compact"/>
+          <w:tcPr>
+            <w:tcW w:type="dxa" w:w="1954"/>
+            <w:vAlign w:val="center"/>
+            <w:shd w:fill="FFFFFF"/>
+          </w:tcPr>
+          <w:p>
+            <w:pPr>
+              <w:pStyle w:val="Compact"/>
+              <w:keepNext w:val="0"/>
+              <w:spacing w:before="0" w:after="0"/>
               <w:jc w:val="right"/>
             </w:pPr>
             <w:r>
+              <w:rPr>
+                <w:rFonts w:ascii="Calibri" w:hAnsi="Calibri"/>
+                <w:b w:val="0"/>
+                <w:color w:val="1D252C"/>
+                <w:sz w:val="18"/>
+              </w:rPr>
               <w:t xml:space="preserve">240</w:t>
             </w:r>
           </w:p>
         </w:tc>
       </w:tr>
       <w:tr>
-        <w:tc>
-          <w:tcPr/>
-          <w:p>
-            <w:pPr>
-              <w:pStyle w:val="Compact"/>
+        <w:trPr>
+          <w:cantSplit/>
+        </w:trPr>
+        <w:tc>
+          <w:tcPr>
+            <w:tcW w:type="dxa" w:w="4464"/>
+            <w:vAlign w:val="center"/>
+            <w:shd w:fill="FFFFFF"/>
+          </w:tcPr>
+          <w:p>
+            <w:pPr>
+              <w:pStyle w:val="Compact"/>
+              <w:keepNext w:val="0"/>
+              <w:spacing w:before="0" w:after="0"/>
               <w:jc w:val="left"/>
             </w:pPr>
             <w:r>
+              <w:rPr>
+                <w:rFonts w:ascii="Calibri" w:hAnsi="Calibri"/>
+                <w:b w:val="0"/>
+                <w:color w:val="1D252C"/>
+                <w:sz w:val="18"/>
+              </w:rPr>
               <w:t xml:space="preserve">MV_PCKG_SAV_DEP_TO_REPAY_RT</w:t>
             </w:r>
           </w:p>
         </w:tc>
         <w:tc>
-          <w:tcPr/>
-          <w:p>
-            <w:pPr>
-              <w:pStyle w:val="Compact"/>
+          <w:tcPr>
+            <w:tcW w:type="dxa" w:w="1953"/>
+            <w:vAlign w:val="center"/>
+            <w:shd w:fill="FFFFFF"/>
+          </w:tcPr>
+          <w:p>
+            <w:pPr>
+              <w:pStyle w:val="Compact"/>
+              <w:keepNext w:val="0"/>
+              <w:spacing w:before="0" w:after="0"/>
               <w:jc w:val="right"/>
             </w:pPr>
             <w:r>
+              <w:rPr>
+                <w:rFonts w:ascii="Calibri" w:hAnsi="Calibri"/>
+                <w:b w:val="0"/>
+                <w:color w:val="1D252C"/>
+                <w:sz w:val="18"/>
+              </w:rPr>
               <w:t xml:space="preserve">1,013</w:t>
             </w:r>
           </w:p>
         </w:tc>
         <w:tc>
-          <w:tcPr/>
-          <w:p>
-            <w:pPr>
-              <w:pStyle w:val="Compact"/>
+          <w:tcPr>
+            <w:tcW w:type="dxa" w:w="1954"/>
+            <w:vAlign w:val="center"/>
+            <w:shd w:fill="FFFFFF"/>
+          </w:tcPr>
+          <w:p>
+            <w:pPr>
+              <w:pStyle w:val="Compact"/>
+              <w:keepNext w:val="0"/>
+              <w:spacing w:before="0" w:after="0"/>
               <w:jc w:val="right"/>
             </w:pPr>
             <w:r>
+              <w:rPr>
+                <w:rFonts w:ascii="Calibri" w:hAnsi="Calibri"/>
+                <w:b w:val="0"/>
+                <w:color w:val="1D252C"/>
+                <w:sz w:val="18"/>
+              </w:rPr>
               <w:t xml:space="preserve">914</w:t>
             </w:r>
           </w:p>
         </w:tc>
         <w:tc>
-          <w:tcPr/>
-          <w:p>
-            <w:pPr>
-              <w:pStyle w:val="Compact"/>
+          <w:tcPr>
+            <w:tcW w:type="dxa" w:w="1954"/>
+            <w:vAlign w:val="center"/>
+            <w:shd w:fill="FFFFFF"/>
+          </w:tcPr>
+          <w:p>
+            <w:pPr>
+              <w:pStyle w:val="Compact"/>
+              <w:keepNext w:val="0"/>
+              <w:spacing w:before="0" w:after="0"/>
               <w:jc w:val="right"/>
             </w:pPr>
             <w:r>
+              <w:rPr>
+                <w:rFonts w:ascii="Calibri" w:hAnsi="Calibri"/>
+                <w:b w:val="0"/>
+                <w:color w:val="1D252C"/>
+                <w:sz w:val="18"/>
+              </w:rPr>
               <w:t xml:space="preserve">240</w:t>
             </w:r>
           </w:p>
@@ -1242,7 +1675,10 @@
     </w:p>
     <w:bookmarkEnd w:id="25"/>
     <w:bookmarkEnd w:id="26"/>
-    <w:sectPr/>
+    <w:sectPr>
+      <w:pgSz w:w="11909" w:h="16834"/>
+      <w:pgMar w:left="792" w:right="792" w:top="864" w:bottom="864"/>
+    </w:sectPr>
   </w:body>
 </w:document>
 </file>
@@ -1457,6 +1893,14 @@
   <w:style w:default="1" w:styleId="Normal" w:type="paragraph">
     <w:name w:val="Normal"/>
     <w:qFormat/>
+    <w:pPr>
+      <w:spacing w:after="120" w:line="252" w:lineRule="auto"/>
+    </w:pPr>
+    <w:rPr>
+      <w:rFonts w:ascii="Calibri" w:hAnsi="Calibri"/>
+      <w:color w:val="1D252C"/>
+      <w:sz w:val="20"/>
+    </w:rPr>
   </w:style>
   <w:style w:styleId="BodyText" w:type="paragraph">
     <w:name w:val="Body Text"/>
@@ -1464,22 +1908,40 @@
     <w:link w:val="BodyTextChar"/>
     <w:qFormat/>
     <w:pPr>
-      <w:spacing w:after="180" w:before="180"/>
+      <w:spacing w:after="120" w:before="180" w:line="252" w:lineRule="auto"/>
     </w:pPr>
+    <w:rPr>
+      <w:rFonts w:ascii="Calibri" w:hAnsi="Calibri"/>
+      <w:color w:val="1D252C"/>
+      <w:sz w:val="20"/>
+    </w:rPr>
   </w:style>
   <w:style w:customStyle="1" w:styleId="FirstParagraph" w:type="paragraph">
     <w:name w:val="First Paragraph"/>
     <w:basedOn w:val="BodyText"/>
     <w:next w:val="BodyText"/>
     <w:qFormat/>
+    <w:pPr>
+      <w:spacing w:after="120" w:line="252" w:lineRule="auto"/>
+    </w:pPr>
+    <w:rPr>
+      <w:rFonts w:ascii="Calibri" w:hAnsi="Calibri"/>
+      <w:color w:val="1D252C"/>
+      <w:sz w:val="20"/>
+    </w:rPr>
   </w:style>
   <w:style w:customStyle="1" w:styleId="Compact" w:type="paragraph">
     <w:name w:val="Compact"/>
     <w:basedOn w:val="BodyText"/>
     <w:qFormat/>
     <w:pPr>
-      <w:spacing w:after="36" w:before="36"/>
+      <w:spacing w:after="120" w:before="36" w:line="252" w:lineRule="auto"/>
     </w:pPr>
+    <w:rPr>
+      <w:rFonts w:ascii="Calibri" w:hAnsi="Calibri"/>
+      <w:color w:val="1D252C"/>
+      <w:sz w:val="20"/>
+    </w:rPr>
   </w:style>
   <w:style w:styleId="Title" w:type="paragraph">
     <w:name w:val="Title"/>
@@ -1489,15 +1951,15 @@
     <w:pPr>
       <w:keepNext/>
       <w:keepLines/>
-      <w:spacing w:after="240" w:before="480"/>
+      <w:spacing w:after="120" w:before="180"/>
       <w:jc w:val="center"/>
     </w:pPr>
     <w:rPr>
-      <w:rFonts w:asciiTheme="majorHAnsi" w:cstheme="majorBidi" w:eastAsiaTheme="majorEastAsia" w:hAnsiTheme="majorHAnsi"/>
+      <w:rFonts w:asciiTheme="majorHAnsi" w:cstheme="majorBidi" w:eastAsiaTheme="majorEastAsia" w:hAnsiTheme="majorHAnsi" w:ascii="Calibri" w:hAnsi="Calibri"/>
       <w:b/>
       <w:bCs/>
-      <w:color w:themeColor="accent1" w:themeShade="B5" w:val="345A8A"/>
-      <w:sz w:val="36"/>
+      <w:color w:val="FC4C02"/>
+      <w:sz w:val="38"/>
       <w:szCs w:val="36"/>
     </w:rPr>
   </w:style>
@@ -1513,6 +1975,7 @@
       <w:jc w:val="center"/>
     </w:pPr>
     <w:rPr>
+      <w:color w:val="1D252C"/>
       <w:sz w:val="30"/>
       <w:szCs w:val="30"/>
     </w:rPr>
@@ -1526,6 +1989,9 @@
       <w:keepLines/>
       <w:jc w:val="center"/>
     </w:pPr>
+    <w:rPr>
+      <w:color w:val="1D252C"/>
+    </w:rPr>
   </w:style>
   <w:style w:styleId="Date" w:type="paragraph">
     <w:name w:val="Date"/>
@@ -1536,6 +2002,9 @@
       <w:keepLines/>
       <w:jc w:val="center"/>
     </w:pPr>
+    <w:rPr>
+      <w:color w:val="1D252C"/>
+    </w:rPr>
   </w:style>
   <w:style w:customStyle="1" w:styleId="AbstractTitle" w:type="paragraph">
     <w:name w:val="Abstract Title"/>
@@ -1550,7 +2019,7 @@
     </w:pPr>
     <w:rPr>
       <w:b/>
-      <w:color w:val="345A8A"/>
+      <w:color w:val="1D252C"/>
       <w:sz w:val="20"/>
       <w:szCs w:val="20"/>
     </w:rPr>
@@ -1566,6 +2035,7 @@
       <w:spacing w:after="300" w:before="100"/>
     </w:pPr>
     <w:rPr>
+      <w:color w:val="1D252C"/>
       <w:sz w:val="20"/>
       <w:szCs w:val="20"/>
     </w:rPr>
@@ -1576,7 +2046,9 @@
     <w:next w:val="Bibliography"/>
     <w:qFormat/>
     <w:pPr/>
-    <w:rPr/>
+    <w:rPr>
+      <w:color w:val="1D252C"/>
+    </w:rPr>
   </w:style>
   <w:style w:styleId="Heading1" w:type="paragraph">
     <w:name w:val="Heading 1"/>
@@ -1587,15 +2059,15 @@
     <w:pPr>
       <w:keepNext/>
       <w:keepLines/>
-      <w:spacing w:after="0" w:before="480"/>
+      <w:spacing w:after="120" w:before="180"/>
       <w:outlineLvl w:val="0"/>
     </w:pPr>
     <w:rPr>
-      <w:rFonts w:asciiTheme="majorHAnsi" w:cstheme="majorBidi" w:eastAsiaTheme="majorEastAsia" w:hAnsiTheme="majorHAnsi"/>
+      <w:rFonts w:asciiTheme="majorHAnsi" w:cstheme="majorBidi" w:eastAsiaTheme="majorEastAsia" w:hAnsiTheme="majorHAnsi" w:ascii="Calibri" w:hAnsi="Calibri"/>
       <w:b/>
       <w:bCs/>
-      <w:color w:themeColor="accent1" w:val="4F81BD"/>
-      <w:sz w:val="32"/>
+      <w:color w:val="FC4C02"/>
+      <w:sz w:val="30"/>
       <w:szCs w:val="32"/>
     </w:rPr>
   </w:style>
@@ -1609,15 +2081,15 @@
     <w:pPr>
       <w:keepNext/>
       <w:keepLines/>
-      <w:spacing w:after="0" w:before="200"/>
+      <w:spacing w:after="120" w:before="180"/>
       <w:outlineLvl w:val="1"/>
     </w:pPr>
     <w:rPr>
-      <w:rFonts w:asciiTheme="majorHAnsi" w:cstheme="majorBidi" w:eastAsiaTheme="majorEastAsia" w:hAnsiTheme="majorHAnsi"/>
+      <w:rFonts w:asciiTheme="majorHAnsi" w:cstheme="majorBidi" w:eastAsiaTheme="majorEastAsia" w:hAnsiTheme="majorHAnsi" w:ascii="Calibri" w:hAnsi="Calibri"/>
       <w:b/>
       <w:bCs/>
-      <w:color w:themeColor="accent1" w:val="4F81BD"/>
-      <w:sz w:val="28"/>
+      <w:color w:val="FC4C02"/>
+      <w:sz w:val="24"/>
       <w:szCs w:val="28"/>
     </w:rPr>
   </w:style>
@@ -1638,7 +2110,7 @@
       <w:rFonts w:asciiTheme="majorHAnsi" w:cstheme="majorBidi" w:eastAsiaTheme="majorEastAsia" w:hAnsiTheme="majorHAnsi"/>
       <w:b/>
       <w:bCs/>
-      <w:color w:themeColor="accent1" w:val="4F81BD"/>
+      <w:color w:val="1D252C"/>
       <w:sz w:val="24"/>
       <w:szCs w:val="24"/>
     </w:rPr>
@@ -1660,7 +2132,7 @@
       <w:rFonts w:asciiTheme="majorHAnsi" w:cstheme="majorBidi" w:eastAsiaTheme="majorEastAsia" w:hAnsiTheme="majorHAnsi"/>
       <w:bCs/>
       <w:i/>
-      <w:color w:themeColor="accent1" w:val="4F81BD"/>
+      <w:color w:val="1D252C"/>
       <w:sz w:val="24"/>
       <w:szCs w:val="24"/>
     </w:rPr>
@@ -1681,7 +2153,7 @@
     <w:rPr>
       <w:rFonts w:asciiTheme="majorHAnsi" w:cstheme="majorBidi" w:eastAsiaTheme="majorEastAsia" w:hAnsiTheme="majorHAnsi"/>
       <w:iCs/>
-      <w:color w:themeColor="accent1" w:val="4F81BD"/>
+      <w:color w:val="1D252C"/>
       <w:sz w:val="24"/>
       <w:szCs w:val="24"/>
     </w:rPr>
@@ -1701,7 +2173,7 @@
     </w:pPr>
     <w:rPr>
       <w:rFonts w:asciiTheme="majorHAnsi" w:cstheme="majorBidi" w:eastAsiaTheme="majorEastAsia" w:hAnsiTheme="majorHAnsi"/>
-      <w:color w:themeColor="accent1" w:val="4F81BD"/>
+      <w:color w:val="1D252C"/>
       <w:sz w:val="24"/>
       <w:szCs w:val="24"/>
     </w:rPr>
@@ -1721,7 +2193,7 @@
     </w:pPr>
     <w:rPr>
       <w:rFonts w:asciiTheme="majorHAnsi" w:cstheme="majorBidi" w:eastAsiaTheme="majorEastAsia" w:hAnsiTheme="majorHAnsi"/>
-      <w:color w:themeColor="accent1" w:val="4F81BD"/>
+      <w:color w:val="1D252C"/>
       <w:sz w:val="24"/>
       <w:szCs w:val="24"/>
     </w:rPr>
@@ -1741,7 +2213,7 @@
     </w:pPr>
     <w:rPr>
       <w:rFonts w:asciiTheme="majorHAnsi" w:cstheme="majorBidi" w:eastAsiaTheme="majorEastAsia" w:hAnsiTheme="majorHAnsi"/>
-      <w:color w:themeColor="accent1" w:val="4F81BD"/>
+      <w:color w:val="1D252C"/>
       <w:sz w:val="24"/>
       <w:szCs w:val="24"/>
     </w:rPr>
@@ -1761,7 +2233,7 @@
     </w:pPr>
     <w:rPr>
       <w:rFonts w:asciiTheme="majorHAnsi" w:cstheme="majorBidi" w:eastAsiaTheme="majorEastAsia" w:hAnsiTheme="majorHAnsi"/>
-      <w:color w:themeColor="accent1" w:val="4F81BD"/>
+      <w:color w:val="1D252C"/>
       <w:sz w:val="24"/>
       <w:szCs w:val="24"/>
     </w:rPr>
@@ -1777,6 +2249,9 @@
       <w:spacing w:after="100" w:before="100"/>
       <w:ind w:firstLine="0" w:left="480" w:right="480"/>
     </w:pPr>
+    <w:rPr>
+      <w:color w:val="1D252C"/>
+    </w:rPr>
   </w:style>
   <w:style w:styleId="FootnoteText" w:type="paragraph">
     <w:name w:val="Footnote Text"/>
@@ -1785,6 +2260,9 @@
     <w:uiPriority w:val="9"/>
     <w:unhideWhenUsed/>
     <w:qFormat/>
+    <w:rPr>
+      <w:color w:val="1D252C"/>
+    </w:rPr>
   </w:style>
   <w:style w:styleId="FootnoteBlockText" w:type="paragraph">
     <w:name w:val="Footnote Block Text"/>
@@ -1797,11 +2275,17 @@
       <w:spacing w:after="100" w:before="100"/>
       <w:ind w:firstLine="0" w:left="480" w:right="480"/>
     </w:pPr>
+    <w:rPr>
+      <w:color w:val="1D252C"/>
+    </w:rPr>
   </w:style>
   <w:style w:default="1" w:styleId="DefaultParagraphFont" w:type="character">
     <w:name w:val="Default Paragraph Font"/>
     <w:semiHidden/>
     <w:unhideWhenUsed/>
+    <w:rPr>
+      <w:color w:val="1D252C"/>
+    </w:rPr>
   </w:style>
   <w:style w:default="1" w:styleId="Table" w:type="table">
     <w:name w:val="Table"/>
@@ -1845,11 +2329,15 @@
     </w:pPr>
     <w:rPr>
       <w:b/>
+      <w:color w:val="1D252C"/>
     </w:rPr>
   </w:style>
   <w:style w:customStyle="1" w:styleId="Definition" w:type="paragraph">
     <w:name w:val="Definition"/>
     <w:basedOn w:val="Normal"/>
+    <w:rPr>
+      <w:color w:val="1D252C"/>
+    </w:rPr>
   </w:style>
   <w:style w:styleId="Caption" w:type="paragraph">
     <w:name w:val="Caption"/>
@@ -1860,6 +2348,7 @@
     </w:pPr>
     <w:rPr>
       <w:i/>
+      <w:color w:val="1D252C"/>
     </w:rPr>
   </w:style>
   <w:style w:customStyle="1" w:styleId="TableCaption" w:type="paragraph">
@@ -1868,14 +2357,23 @@
     <w:pPr>
       <w:keepNext/>
     </w:pPr>
+    <w:rPr>
+      <w:color w:val="1D252C"/>
+    </w:rPr>
   </w:style>
   <w:style w:customStyle="1" w:styleId="ImageCaption" w:type="paragraph">
     <w:name w:val="Image Caption"/>
     <w:basedOn w:val="Caption"/>
+    <w:rPr>
+      <w:color w:val="1D252C"/>
+    </w:rPr>
   </w:style>
   <w:style w:customStyle="1" w:styleId="Figure" w:type="paragraph">
     <w:name w:val="Figure"/>
     <w:basedOn w:val="Normal"/>
+    <w:rPr>
+      <w:color w:val="1D252C"/>
+    </w:rPr>
   </w:style>
   <w:style w:customStyle="1" w:styleId="CaptionedFigure" w:type="paragraph">
     <w:name w:val="Captioned Figure"/>
@@ -1883,28 +2381,39 @@
     <w:pPr>
       <w:keepNext/>
     </w:pPr>
+    <w:rPr>
+      <w:color w:val="1D252C"/>
+    </w:rPr>
   </w:style>
   <w:style w:customStyle="1" w:styleId="BodyTextChar" w:type="character">
     <w:name w:val="Body Text Char"/>
     <w:basedOn w:val="DefaultParagraphFont"/>
     <w:link w:val="BodyText"/>
+    <w:rPr>
+      <w:color w:val="1D252C"/>
+    </w:rPr>
   </w:style>
   <w:style w:customStyle="1" w:styleId="VerbatimChar" w:type="character">
     <w:name w:val="Verbatim Char"/>
     <w:basedOn w:val="BodyTextChar"/>
     <w:rPr>
       <w:rFonts w:ascii="Consolas" w:hAnsi="Consolas"/>
+      <w:color w:val="1D252C"/>
       <w:sz w:val="22"/>
     </w:rPr>
   </w:style>
   <w:style w:customStyle="1" w:styleId="SectionNumber" w:type="character">
     <w:name w:val="Section Number"/>
     <w:basedOn w:val="BodyTextChar"/>
+    <w:rPr>
+      <w:color w:val="1D252C"/>
+    </w:rPr>
   </w:style>
   <w:style w:styleId="FootnoteReference" w:type="character">
     <w:name w:val="Footnote Reference"/>
     <w:basedOn w:val="BodyTextChar"/>
     <w:rPr>
+      <w:color w:val="1D252C"/>
       <w:vertAlign w:val="superscript"/>
     </w:rPr>
   </w:style>
@@ -1912,7 +2421,7 @@
     <w:name w:val="Hyperlink"/>
     <w:basedOn w:val="BodyTextChar"/>
     <w:rPr>
-      <w:color w:themeColor="accent1" w:val="4F81BD"/>
+      <w:color w:val="1D252C"/>
     </w:rPr>
   </w:style>
   <w:style w:styleId="TOCHeading" w:type="paragraph">
@@ -1930,7 +2439,7 @@
       <w:rFonts w:asciiTheme="majorHAnsi" w:cstheme="majorBidi" w:eastAsiaTheme="majorEastAsia" w:hAnsiTheme="majorHAnsi"/>
       <w:b w:val="0"/>
       <w:bCs w:val="0"/>
-      <w:color w:themeColor="accent1" w:themeShade="BF" w:val="365F91"/>
+      <w:color w:val="1D252C"/>
     </w:rPr>
   </w:style>
   <w:style w:type="paragraph" w:customStyle="1" w:styleId="SourceCode">
@@ -1940,83 +2449,86 @@
     <w:pPr>
       <w:wordWrap w:val="off"/>
     </w:pPr>
+    <w:rPr>
+      <w:color w:val="1D252C"/>
+    </w:rPr>
   </w:style>
   <w:style w:type="character" w:customStyle="1" w:styleId="KeywordTok">
     <w:name w:val="KeywordTok"/>
     <w:basedOn w:val="VerbatimChar"/>
     <w:rPr>
       <w:b/>
-      <w:color w:val="007020"/>
+      <w:color w:val="1D252C"/>
     </w:rPr>
   </w:style>
   <w:style w:type="character" w:customStyle="1" w:styleId="DataTypeTok">
     <w:name w:val="DataTypeTok"/>
     <w:basedOn w:val="VerbatimChar"/>
     <w:rPr>
-      <w:color w:val="902000"/>
+      <w:color w:val="1D252C"/>
     </w:rPr>
   </w:style>
   <w:style w:type="character" w:customStyle="1" w:styleId="DecValTok">
     <w:name w:val="DecValTok"/>
     <w:basedOn w:val="VerbatimChar"/>
     <w:rPr>
-      <w:color w:val="40a070"/>
+      <w:color w:val="1D252C"/>
     </w:rPr>
   </w:style>
   <w:style w:type="character" w:customStyle="1" w:styleId="BaseNTok">
     <w:name w:val="BaseNTok"/>
     <w:basedOn w:val="VerbatimChar"/>
     <w:rPr>
-      <w:color w:val="40a070"/>
+      <w:color w:val="1D252C"/>
     </w:rPr>
   </w:style>
   <w:style w:type="character" w:customStyle="1" w:styleId="FloatTok">
     <w:name w:val="FloatTok"/>
     <w:basedOn w:val="VerbatimChar"/>
     <w:rPr>
-      <w:color w:val="40a070"/>
+      <w:color w:val="1D252C"/>
     </w:rPr>
   </w:style>
   <w:style w:type="character" w:customStyle="1" w:styleId="ConstantTok">
     <w:name w:val="ConstantTok"/>
     <w:basedOn w:val="VerbatimChar"/>
     <w:rPr>
-      <w:color w:val="880000"/>
+      <w:color w:val="1D252C"/>
     </w:rPr>
   </w:style>
   <w:style w:type="character" w:customStyle="1" w:styleId="CharTok">
     <w:name w:val="CharTok"/>
     <w:basedOn w:val="VerbatimChar"/>
     <w:rPr>
-      <w:color w:val="4070a0"/>
+      <w:color w:val="1D252C"/>
     </w:rPr>
   </w:style>
   <w:style w:type="character" w:customStyle="1" w:styleId="SpecialCharTok">
     <w:name w:val="SpecialCharTok"/>
     <w:basedOn w:val="VerbatimChar"/>
     <w:rPr>
-      <w:color w:val="4070a0"/>
+      <w:color w:val="1D252C"/>
     </w:rPr>
   </w:style>
   <w:style w:type="character" w:customStyle="1" w:styleId="StringTok">
     <w:name w:val="StringTok"/>
     <w:basedOn w:val="VerbatimChar"/>
     <w:rPr>
-      <w:color w:val="4070a0"/>
+      <w:color w:val="1D252C"/>
     </w:rPr>
   </w:style>
   <w:style w:type="character" w:customStyle="1" w:styleId="VerbatimStringTok">
     <w:name w:val="VerbatimStringTok"/>
     <w:basedOn w:val="VerbatimChar"/>
     <w:rPr>
-      <w:color w:val="4070a0"/>
+      <w:color w:val="1D252C"/>
     </w:rPr>
   </w:style>
   <w:style w:type="character" w:customStyle="1" w:styleId="SpecialStringTok">
     <w:name w:val="SpecialStringTok"/>
     <w:basedOn w:val="VerbatimChar"/>
     <w:rPr>
-      <w:color w:val="bb6688"/>
+      <w:color w:val="1D252C"/>
     </w:rPr>
   </w:style>
   <w:style w:type="character" w:customStyle="1" w:styleId="ImportTok">
@@ -2024,7 +2536,7 @@
     <w:basedOn w:val="VerbatimChar"/>
     <w:rPr>
       <w:b/>
-      <w:color w:val="008000"/>
+      <w:color w:val="1D252C"/>
     </w:rPr>
   </w:style>
   <w:style w:type="character" w:customStyle="1" w:styleId="CommentTok">
@@ -2032,7 +2544,7 @@
     <w:basedOn w:val="VerbatimChar"/>
     <w:rPr>
       <w:i/>
-      <w:color w:val="60a0b0"/>
+      <w:color w:val="1D252C"/>
     </w:rPr>
   </w:style>
   <w:style w:type="character" w:customStyle="1" w:styleId="DocumentationTok">
@@ -2040,7 +2552,7 @@
     <w:basedOn w:val="VerbatimChar"/>
     <w:rPr>
       <w:i/>
-      <w:color w:val="ba2121"/>
+      <w:color w:val="1D252C"/>
     </w:rPr>
   </w:style>
   <w:style w:type="character" w:customStyle="1" w:styleId="AnnotationTok">
@@ -2049,7 +2561,7 @@
     <w:rPr>
       <w:b/>
       <w:i/>
-      <w:color w:val="60a0b0"/>
+      <w:color w:val="1D252C"/>
     </w:rPr>
   </w:style>
   <w:style w:type="character" w:customStyle="1" w:styleId="CommentVarTok">
@@ -2058,28 +2570,28 @@
     <w:rPr>
       <w:b/>
       <w:i/>
-      <w:color w:val="60a0b0"/>
+      <w:color w:val="1D252C"/>
     </w:rPr>
   </w:style>
   <w:style w:type="character" w:customStyle="1" w:styleId="OtherTok">
     <w:name w:val="OtherTok"/>
     <w:basedOn w:val="VerbatimChar"/>
     <w:rPr>
-      <w:color w:val="007020"/>
+      <w:color w:val="1D252C"/>
     </w:rPr>
   </w:style>
   <w:style w:type="character" w:customStyle="1" w:styleId="FunctionTok">
     <w:name w:val="FunctionTok"/>
     <w:basedOn w:val="VerbatimChar"/>
     <w:rPr>
-      <w:color w:val="06287e"/>
+      <w:color w:val="1D252C"/>
     </w:rPr>
   </w:style>
   <w:style w:type="character" w:customStyle="1" w:styleId="VariableTok">
     <w:name w:val="VariableTok"/>
     <w:basedOn w:val="VerbatimChar"/>
     <w:rPr>
-      <w:color w:val="19177c"/>
+      <w:color w:val="1D252C"/>
     </w:rPr>
   </w:style>
   <w:style w:type="character" w:customStyle="1" w:styleId="ControlFlowTok">
@@ -2087,46 +2599,50 @@
     <w:basedOn w:val="VerbatimChar"/>
     <w:rPr>
       <w:b/>
-      <w:color w:val="007020"/>
+      <w:color w:val="1D252C"/>
     </w:rPr>
   </w:style>
   <w:style w:type="character" w:customStyle="1" w:styleId="OperatorTok">
     <w:name w:val="OperatorTok"/>
     <w:basedOn w:val="VerbatimChar"/>
     <w:rPr>
-      <w:color w:val="666666"/>
+      <w:color w:val="1D252C"/>
     </w:rPr>
   </w:style>
   <w:style w:type="character" w:customStyle="1" w:styleId="BuiltInTok">
     <w:name w:val="BuiltInTok"/>
     <w:basedOn w:val="VerbatimChar"/>
     <w:rPr>
-      <w:color w:val="008000"/>
+      <w:color w:val="1D252C"/>
     </w:rPr>
   </w:style>
   <w:style w:type="character" w:customStyle="1" w:styleId="ExtensionTok">
     <w:name w:val="ExtensionTok"/>
     <w:basedOn w:val="VerbatimChar"/>
-    <w:rPr/>
+    <w:rPr>
+      <w:color w:val="1D252C"/>
+    </w:rPr>
   </w:style>
   <w:style w:type="character" w:customStyle="1" w:styleId="PreprocessorTok">
     <w:name w:val="PreprocessorTok"/>
     <w:basedOn w:val="VerbatimChar"/>
     <w:rPr>
-      <w:color w:val="bc7a00"/>
+      <w:color w:val="1D252C"/>
     </w:rPr>
   </w:style>
   <w:style w:type="character" w:customStyle="1" w:styleId="AttributeTok">
     <w:name w:val="AttributeTok"/>
     <w:basedOn w:val="VerbatimChar"/>
     <w:rPr>
-      <w:color w:val="7d9029"/>
+      <w:color w:val="1D252C"/>
     </w:rPr>
   </w:style>
   <w:style w:type="character" w:customStyle="1" w:styleId="RegionMarkerTok">
     <w:name w:val="RegionMarkerTok"/>
     <w:basedOn w:val="VerbatimChar"/>
-    <w:rPr/>
+    <w:rPr>
+      <w:color w:val="1D252C"/>
+    </w:rPr>
   </w:style>
   <w:style w:type="character" w:customStyle="1" w:styleId="InformationTok">
     <w:name w:val="InformationTok"/>
@@ -2134,7 +2650,7 @@
     <w:rPr>
       <w:b/>
       <w:i/>
-      <w:color w:val="60a0b0"/>
+      <w:color w:val="1D252C"/>
     </w:rPr>
   </w:style>
   <w:style w:type="character" w:customStyle="1" w:styleId="WarningTok">
@@ -2143,7 +2659,7 @@
     <w:rPr>
       <w:b/>
       <w:i/>
-      <w:color w:val="60a0b0"/>
+      <w:color w:val="1D252C"/>
     </w:rPr>
   </w:style>
   <w:style w:type="character" w:customStyle="1" w:styleId="AlertTok">
@@ -2151,7 +2667,7 @@
     <w:basedOn w:val="VerbatimChar"/>
     <w:rPr>
       <w:b/>
-      <w:color w:val="ff0000"/>
+      <w:color w:val="1D252C"/>
     </w:rPr>
   </w:style>
   <w:style w:type="character" w:customStyle="1" w:styleId="ErrorTok">
@@ -2159,13 +2675,15 @@
     <w:basedOn w:val="VerbatimChar"/>
     <w:rPr>
       <w:b/>
-      <w:color w:val="ff0000"/>
+      <w:color w:val="1D252C"/>
     </w:rPr>
   </w:style>
   <w:style w:type="character" w:customStyle="1" w:styleId="NormalTok">
     <w:name w:val="NormalTok"/>
     <w:basedOn w:val="VerbatimChar"/>
-    <w:rPr/>
+    <w:rPr>
+      <w:color w:val="1D252C"/>
+    </w:rPr>
   </w:style>
 </w:styles>
 </file>
@@ -2175,40 +2693,40 @@
   <a:themeElements>
     <a:clrScheme name="Office">
       <a:dk1>
-        <a:sysClr val="windowText" lastClr="000000"/>
+        <a:srgbClr val="1D252C"/>
       </a:dk1>
       <a:lt1>
-        <a:sysClr val="window" lastClr="FFFFFF"/>
+        <a:srgbClr val="FFFFFF"/>
       </a:lt1>
       <a:dk2>
-        <a:srgbClr val="1F497D"/>
+        <a:srgbClr val="1D252C"/>
       </a:dk2>
       <a:lt2>
-        <a:srgbClr val="EEECE1"/>
+        <a:srgbClr val="FFFFFF"/>
       </a:lt2>
       <a:accent1>
-        <a:srgbClr val="4F81BD"/>
+        <a:srgbClr val="FC4C02"/>
       </a:accent1>
       <a:accent2>
-        <a:srgbClr val="C0504D"/>
+        <a:srgbClr val="FC4C02"/>
       </a:accent2>
       <a:accent3>
-        <a:srgbClr val="9BBB59"/>
+        <a:srgbClr val="FC4C02"/>
       </a:accent3>
       <a:accent4>
-        <a:srgbClr val="8064A2"/>
+        <a:srgbClr val="FC4C02"/>
       </a:accent4>
       <a:accent5>
-        <a:srgbClr val="4BACC6"/>
+        <a:srgbClr val="FC4C02"/>
       </a:accent5>
       <a:accent6>
-        <a:srgbClr val="F79646"/>
+        <a:srgbClr val="FC4C02"/>
       </a:accent6>
       <a:hlink>
-        <a:srgbClr val="0000FF"/>
+        <a:srgbClr val="FC4C02"/>
       </a:hlink>
       <a:folHlink>
-        <a:srgbClr val="800080"/>
+        <a:srgbClr val="FC4C02"/>
       </a:folHlink>
     </a:clrScheme>
     <a:fontScheme name="Office">

</xml_diff>

<commit_message>
Move limited December 2013 gaps to lower-priority RDS observations
</commit_message>
<xml_diff>
--- a/DQ_ENGINE/review_results/RDS/2026-10-27/RDS_account_level_findings.docx
+++ b/DQ_ENGINE/review_results/RDS/2026-10-27/RDS_account_level_findings.docx
@@ -783,180 +783,6 @@
     </w:p>
     <w:bookmarkEnd w:id="20"/>
     <w:bookmarkStart w:id="21" w:name="X6a3368e7e15ad8e304e7e04fbbf3fe2a7b04e02"/>
-    <w:p>
-      <w:pPr>
-        <w:pStyle w:val="Heading2"/>
-      </w:pPr>
-      <w:r>
-        <w:t xml:space="preserve">2. December 2013: temporary missing and special values</w:t>
-      </w:r>
-    </w:p>
-    <w:p>
-      <w:pPr>
-        <w:pStyle w:val="FirstParagraph"/>
-      </w:pPr>
-      <w:r>
-        <w:rPr>
-          <w:rStyle w:val="VerbatimChar"/>
-        </w:rPr>
-        <w:t xml:space="preserve">Numeric_Specific</w:t>
-      </w:r>
-      <w:r>
-        <w:t xml:space="preserve"> </w:t>
-      </w:r>
-      <w:r>
-        <w:t xml:space="preserve">contains 128</w:t>
-      </w:r>
-      <w:r>
-        <w:t xml:space="preserve"> </w:t>
-      </w:r>
-      <w:r>
-        <w:rPr>
-          <w:rStyle w:val="VerbatimChar"/>
-        </w:rPr>
-        <w:t xml:space="preserve">PCKG_REPAY_AMT</w:t>
-      </w:r>
-      <w:r>
-        <w:t xml:space="preserve"> </w:t>
-      </w:r>
-      <w:r>
-        <w:t xml:space="preserve">observations that were populated</w:t>
-      </w:r>
-      <w:r>
-        <w:t xml:space="preserve"> </w:t>
-      </w:r>
-      <w:r>
-        <w:t xml:space="preserve">in November, missing in December and populated again in January. It also shows</w:t>
-      </w:r>
-      <w:r>
-        <w:t xml:space="preserve"> </w:t>
-      </w:r>
-      <w:r>
-        <w:t xml:space="preserve">43 temporary</w:t>
-      </w:r>
-      <w:r>
-        <w:t xml:space="preserve"> </w:t>
-      </w:r>
-      <w:r>
-        <w:rPr>
-          <w:rStyle w:val="VerbatimChar"/>
-        </w:rPr>
-        <w:t xml:space="preserve">-999993</w:t>
-      </w:r>
-      <w:r>
-        <w:t xml:space="preserve"> </w:t>
-      </w:r>
-      <w:r>
-        <w:t xml:space="preserve">values in</w:t>
-      </w:r>
-      <w:r>
-        <w:t xml:space="preserve"> </w:t>
-      </w:r>
-      <w:r>
-        <w:rPr>
-          <w:rStyle w:val="VerbatimChar"/>
-        </w:rPr>
-        <w:t xml:space="preserve">MV_PCKG_LOAN_TO_INC_RT</w:t>
-      </w:r>
-      <w:r>
-        <w:t xml:space="preserve"> </w:t>
-      </w:r>
-      <w:r>
-        <w:t xml:space="preserve">and 60 in</w:t>
-      </w:r>
-      <w:r>
-        <w:t xml:space="preserve"> </w:t>
-      </w:r>
-      <w:r>
-        <w:rPr>
-          <w:rStyle w:val="VerbatimChar"/>
-        </w:rPr>
-        <w:t xml:space="preserve">MV_PCKG_REPAY_TO_INC_RT</w:t>
-      </w:r>
-      <w:r>
-        <w:t xml:space="preserve">. All 43 loan-to-income values returned exactly to their</w:t>
-      </w:r>
-      <w:r>
-        <w:t xml:space="preserve"> </w:t>
-      </w:r>
-      <w:r>
-        <w:t xml:space="preserve">November value in January.</w:t>
-      </w:r>
-    </w:p>
-    <w:p>
-      <w:pPr>
-        <w:pStyle w:val="BodyText"/>
-      </w:pPr>
-      <w:r>
-        <w:t xml:space="preserve">Separately,</w:t>
-      </w:r>
-      <w:r>
-        <w:t xml:space="preserve"> </w:t>
-      </w:r>
-      <w:r>
-        <w:rPr>
-          <w:rStyle w:val="VerbatimChar"/>
-        </w:rPr>
-        <w:t xml:space="preserve">Categorical_POU</w:t>
-      </w:r>
-      <w:r>
-        <w:t xml:space="preserve"> </w:t>
-      </w:r>
-      <w:r>
-        <w:t xml:space="preserve">records 111 temporary missing</w:t>
-      </w:r>
-      <w:r>
-        <w:t xml:space="preserve"> </w:t>
-      </w:r>
-      <w:r>
-        <w:rPr>
-          <w:rStyle w:val="VerbatimChar"/>
-        </w:rPr>
-        <w:t xml:space="preserve">REPAY_TYPE_CD</w:t>
-      </w:r>
-      <w:r>
-        <w:t xml:space="preserve"> </w:t>
-      </w:r>
-      <w:r>
-        <w:t xml:space="preserve">events in December. It does not show their individual account sequences.</w:t>
-      </w:r>
-    </w:p>
-    <w:p>
-      <w:pPr>
-        <w:pStyle w:val="BodyText"/>
-      </w:pPr>
-      <w:r>
-        <w:rPr>
-          <w:b/>
-          <w:bCs/>
-        </w:rPr>
-        <w:t xml:space="preserve">Question for CDAO:</w:t>
-      </w:r>
-      <w:r>
-        <w:t xml:space="preserve"> </w:t>
-      </w:r>
-      <w:r>
-        <w:t xml:space="preserve">What caused the one-month gaps in repayment, ratios and</w:t>
-      </w:r>
-      <w:r>
-        <w:t xml:space="preserve"> </w:t>
-      </w:r>
-      <w:r>
-        <w:t xml:space="preserve">repayment type, and are they expected or a data quality issue?</w:t>
-      </w:r>
-    </w:p>
-    <w:p>
-      <w:pPr>
-        <w:pStyle w:val="BodyText"/>
-      </w:pPr>
-      <w:r>
-        <w:rPr>
-          <w:i/>
-          <w:iCs/>
-        </w:rPr>
-        <w:t xml:space="preserve">Evidence: Numeric_Specific, Numeric_POU and Categorical_POU.</w:t>
-      </w:r>
-    </w:p>
     <w:bookmarkEnd w:id="21"/>
     <w:bookmarkStart w:id="22" w:name="X55f1a69a80e8ff1ffb4ecdea93443ca6beeb235"/>
     <w:p>
@@ -964,7 +790,7 @@
         <w:pStyle w:val="Heading2"/>
       </w:pPr>
       <w:r>
-        <w:t xml:space="preserve">3. Temporary special values in savings and payment ratios</w:t>
+        <w:t>2. Temporary special values in savings and payment ratios</w:t>
       </w:r>
     </w:p>
     <w:tbl>
@@ -1420,7 +1246,7 @@
         <w:pStyle w:val="Heading2"/>
       </w:pPr>
       <w:r>
-        <w:t xml:space="preserve">4. Large historical movements</w:t>
+        <w:t>3. Large historical movements</w:t>
       </w:r>
     </w:p>
     <w:p>
@@ -1534,7 +1360,197 @@
         <w:pStyle w:val="Heading2"/>
       </w:pPr>
       <w:r>
-        <w:t xml:space="preserve">Lower-priority categorical observations</w:t>
+        <w:t>Lower-priority observations</w:t>
+      </w:r>
+    </w:p>
+    <w:p>
+      <w:pPr>
+        <w:pStyle w:val="Heading3"/>
+      </w:pPr>
+      <w:r>
+        <w:t>December 2013: limited temporary gaps requiring clarification</w:t>
+      </w:r>
+    </w:p>
+    <w:p>
+      <w:pPr>
+        <w:pStyle w:val="FirstParagraph"/>
+      </w:pPr>
+      <w:r>
+        <w:rPr>
+          <w:rStyle w:val="VerbatimChar"/>
+        </w:rPr>
+        <w:t xml:space="preserve">Numeric_Specific</w:t>
+      </w:r>
+      <w:r>
+        <w:t xml:space="preserve"> </w:t>
+      </w:r>
+      <w:r>
+        <w:t xml:space="preserve">contains 128</w:t>
+      </w:r>
+      <w:r>
+        <w:t xml:space="preserve"> </w:t>
+      </w:r>
+      <w:r>
+        <w:rPr>
+          <w:rStyle w:val="VerbatimChar"/>
+        </w:rPr>
+        <w:t xml:space="preserve">PCKG_REPAY_AMT</w:t>
+      </w:r>
+      <w:r>
+        <w:t xml:space="preserve"> </w:t>
+      </w:r>
+      <w:r>
+        <w:t xml:space="preserve">observations that were populated</w:t>
+      </w:r>
+      <w:r>
+        <w:t xml:space="preserve"> </w:t>
+      </w:r>
+      <w:r>
+        <w:t xml:space="preserve">in November, missing in December and populated again in January. It also shows</w:t>
+      </w:r>
+      <w:r>
+        <w:t xml:space="preserve"> </w:t>
+      </w:r>
+      <w:r>
+        <w:t xml:space="preserve">43 temporary</w:t>
+      </w:r>
+      <w:r>
+        <w:t xml:space="preserve"> </w:t>
+      </w:r>
+      <w:r>
+        <w:rPr>
+          <w:rStyle w:val="VerbatimChar"/>
+        </w:rPr>
+        <w:t xml:space="preserve">-999993</w:t>
+      </w:r>
+      <w:r>
+        <w:t xml:space="preserve"> </w:t>
+      </w:r>
+      <w:r>
+        <w:t xml:space="preserve">values in</w:t>
+      </w:r>
+      <w:r>
+        <w:t xml:space="preserve"> </w:t>
+      </w:r>
+      <w:r>
+        <w:rPr>
+          <w:rStyle w:val="VerbatimChar"/>
+        </w:rPr>
+        <w:t xml:space="preserve">MV_PCKG_LOAN_TO_INC_RT</w:t>
+      </w:r>
+      <w:r>
+        <w:t xml:space="preserve"> </w:t>
+      </w:r>
+      <w:r>
+        <w:t xml:space="preserve">and 60 in</w:t>
+      </w:r>
+      <w:r>
+        <w:t xml:space="preserve"> </w:t>
+      </w:r>
+      <w:r>
+        <w:rPr>
+          <w:rStyle w:val="VerbatimChar"/>
+        </w:rPr>
+        <w:t xml:space="preserve">MV_PCKG_REPAY_TO_INC_RT</w:t>
+      </w:r>
+      <w:r>
+        <w:t xml:space="preserve">. All 43 loan-to-income values returned exactly to their</w:t>
+      </w:r>
+      <w:r>
+        <w:t xml:space="preserve"> </w:t>
+      </w:r>
+      <w:r>
+        <w:t xml:space="preserve">November value in January.</w:t>
+      </w:r>
+    </w:p>
+    <w:p>
+      <w:pPr>
+        <w:pStyle w:val="BodyText"/>
+      </w:pPr>
+      <w:r>
+        <w:t xml:space="preserve">Separately,</w:t>
+      </w:r>
+      <w:r>
+        <w:t xml:space="preserve"> </w:t>
+      </w:r>
+      <w:r>
+        <w:rPr>
+          <w:rStyle w:val="VerbatimChar"/>
+        </w:rPr>
+        <w:t xml:space="preserve">Categorical_POU</w:t>
+      </w:r>
+      <w:r>
+        <w:t xml:space="preserve"> </w:t>
+      </w:r>
+      <w:r>
+        <w:t xml:space="preserve">records 111 temporary missing</w:t>
+      </w:r>
+      <w:r>
+        <w:t xml:space="preserve"> </w:t>
+      </w:r>
+      <w:r>
+        <w:rPr>
+          <w:rStyle w:val="VerbatimChar"/>
+        </w:rPr>
+        <w:t xml:space="preserve">REPAY_TYPE_CD</w:t>
+      </w:r>
+      <w:r>
+        <w:t xml:space="preserve"> </w:t>
+      </w:r>
+      <w:r>
+        <w:t xml:space="preserve">events in December. It does not show their individual account sequences.</w:t>
+      </w:r>
+    </w:p>
+    <w:p>
+      <w:pPr>
+        <w:pStyle w:val="BodyText"/>
+      </w:pPr>
+      <w:r>
+        <w:t>Treat this as a lower-priority historical observation. The eligible-population percentage and downstream impact are not established in this report, so the count alone does not demonstrate a material issue. Account overlap across these fields has not been established.</w:t>
+      </w:r>
+    </w:p>
+    <w:p>
+      <w:pPr>
+        <w:pStyle w:val="BodyText"/>
+      </w:pPr>
+      <w:r>
+        <w:rPr>
+          <w:b/>
+          <w:bCs/>
+        </w:rPr>
+      </w:r>
+      <w:r/>
+      <w:r/>
+      <w:r/>
+      <w:r/>
+      <w:r>
+        <w:rPr>
+          <w:b/>
+        </w:rPr>
+        <w:t xml:space="preserve">Question for CDAO: </w:t>
+      </w:r>
+      <w:r>
+        <w:t>Please explain whether these temporary December 2013 gaps were expected processing effects and whether they affected downstream use.</w:t>
+      </w:r>
+    </w:p>
+    <w:p>
+      <w:pPr>
+        <w:pStyle w:val="BodyText"/>
+      </w:pPr>
+      <w:r>
+        <w:rPr>
+          <w:i/>
+          <w:iCs/>
+        </w:rPr>
+        <w:t xml:space="preserve">Evidence: Numeric_Specific, Numeric_POU and Categorical_POU.</w:t>
+      </w:r>
+    </w:p>
+    <w:p>
+      <w:pPr>
+        <w:pStyle w:val="Heading3"/>
+      </w:pPr>
+      <w:r>
+        <w:t>Categorical observations</w:t>
       </w:r>
     </w:p>
     <w:p>
@@ -2103,15 +2119,15 @@
     <w:pPr>
       <w:keepNext/>
       <w:keepLines/>
-      <w:spacing w:after="0" w:before="200"/>
+      <w:spacing w:after="100" w:before="160"/>
       <w:outlineLvl w:val="2"/>
     </w:pPr>
     <w:rPr>
-      <w:rFonts w:asciiTheme="majorHAnsi" w:cstheme="majorBidi" w:eastAsiaTheme="majorEastAsia" w:hAnsiTheme="majorHAnsi"/>
+      <w:rFonts w:asciiTheme="majorHAnsi" w:cstheme="majorBidi" w:eastAsiaTheme="majorEastAsia" w:hAnsiTheme="majorHAnsi" w:ascii="Calibri" w:hAnsi="Calibri"/>
       <w:b/>
       <w:bCs/>
-      <w:color w:val="1D252C"/>
-      <w:sz w:val="24"/>
+      <w:color w:val="FC4C02"/>
+      <w:sz w:val="22"/>
       <w:szCs w:val="24"/>
     </w:rPr>
   </w:style>

</xml_diff>